<commit_message>
Session report: add update note on later progress
Co-Authored-By: Claude Sonnet 5.5 <noreply@anthropic.com>
Claude-Session: https://claude.ai/code/session_0121vD7AA3TFLECREuH1WBqj
</commit_message>
<xml_diff>
--- a/notes/Session_Report_Vol1-6.docx
+++ b/notes/Session_Report_Vol1-6.docx
@@ -56,19 +56,119 @@
       </w:r>
     </w:p>
     <w:p>
+      <w:pPr>
+        <w:pStyle w:val="BlockText"/>
+      </w:pPr>
+      <w:r>
+        <w:rPr>
+          <w:b/>
+          <w:bCs/>
+        </w:rPr>
+        <w:t xml:space="preserve">Update (26 Oct 2026, when this report was finalized).</w:t>
+      </w:r>
+      <w:r>
+        <w:t xml:space="preserve"> </w:t>
+      </w:r>
+      <w:r>
+        <w:t xml:space="preserve">This report describes the work of the session itself, which ended at Volume 6, Sūkta 62, printed p. 28. The branch</w:t>
+      </w:r>
+      <w:r>
+        <w:t xml:space="preserve"> </w:t>
+      </w:r>
+      <w:r>
+        <w:rPr>
+          <w:rStyle w:val="VerbatimChar"/>
+        </w:rPr>
+        <w:t xml:space="preserve">claude/modest-ptolemy-9efv8s</w:t>
+      </w:r>
+      <w:r>
+        <w:t xml:space="preserve"> </w:t>
+      </w:r>
+      <w:r>
+        <w:t xml:space="preserve">has since advanced through later sessions:</w:t>
+      </w:r>
+      <w:r>
+        <w:t xml:space="preserve"> </w:t>
+      </w:r>
+      <w:r>
+        <w:rPr>
+          <w:b/>
+          <w:bCs/>
+        </w:rPr>
+        <w:t xml:space="preserve">Volume 6 was completed on 7 Oct</w:t>
+      </w:r>
+      <w:r>
+        <w:t xml:space="preserve"> </w:t>
+      </w:r>
+      <w:r>
+        <w:t xml:space="preserve">(Sūktas 62–80, with the Fifth Adhyāya colophon; docx and PDF built), and Volumes 7–11 now have translation files on the branch (Volumes 1–9 are marked complete in</w:t>
+      </w:r>
+      <w:r>
+        <w:t xml:space="preserve"> </w:t>
+      </w:r>
+      <w:r>
+        <w:rPr>
+          <w:rStyle w:val="VerbatimChar"/>
+        </w:rPr>
+        <w:t xml:space="preserve">CLAUDE.md</w:t>
+      </w:r>
+      <w:r>
+        <w:t xml:space="preserve">; Volume 11 is being corrected page by page against a better scan). Sections 1 and 4 below show the position as of this session’s end, with the later state noted.</w:t>
+      </w:r>
+      <w:r>
+        <w:t xml:space="preserve"> </w:t>
+      </w:r>
+      <w:r>
+        <w:rPr>
+          <w:b/>
+          <w:bCs/>
+        </w:rPr>
+        <w:t xml:space="preserve">For the current position always read</w:t>
+      </w:r>
+      <w:r>
+        <w:rPr>
+          <w:b/>
+          <w:bCs/>
+        </w:rPr>
+        <w:t xml:space="preserve"> </w:t>
+      </w:r>
+      <w:r>
+        <w:rPr>
+          <w:rStyle w:val="VerbatimChar"/>
+          <w:b/>
+          <w:bCs/>
+        </w:rPr>
+        <w:t xml:space="preserve">CLAUDE.md</w:t>
+      </w:r>
+      <w:r>
+        <w:rPr>
+          <w:b/>
+          <w:bCs/>
+        </w:rPr>
+        <w:t xml:space="preserve"> </w:t>
+      </w:r>
+      <w:r>
+        <w:rPr>
+          <w:b/>
+          <w:bCs/>
+        </w:rPr>
+        <w:t xml:space="preserve">and the tail of the newest volume file.</w:t>
+      </w:r>
+    </w:p>
+    <w:p>
       <w:r>
         <w:pict>
           <v:rect style="width:0;height:1.5pt" o:hralign="center" o:hrstd="t" o:hr="t"/>
         </w:pict>
       </w:r>
     </w:p>
-    <w:bookmarkStart w:id="9" w:name="where-things-stand"/>
+    <w:bookmarkStart w:id="9" w:name="Xe80d8866cce8b89d85db5f9db0bf24774d76f8f"/>
     <w:p>
       <w:pPr>
         <w:pStyle w:val="Heading2"/>
       </w:pPr>
       <w:r>
-        <w:t xml:space="preserve">1. Where things stand</w:t>
+        <w:t xml:space="preserve">1. Where things stand (at the end of this session)</w:t>
       </w:r>
     </w:p>
     <w:tbl>
@@ -335,17 +435,52 @@
               <w:pStyle w:val="Compact"/>
             </w:pPr>
             <w:r>
-              <w:rPr>
-                <w:b/>
-                <w:bCs/>
-              </w:rPr>
-              <w:t xml:space="preserve">In progress</w:t>
+              <w:t xml:space="preserve">In progress at the end of this session (Sūkta 62 through printed p. 28);</w:t>
             </w:r>
             <w:r>
               <w:t xml:space="preserve"> </w:t>
             </w:r>
             <w:r>
-              <w:t xml:space="preserve">— Sūkta 62 translated through printed p. 28</w:t>
+              <w:rPr>
+                <w:b/>
+                <w:bCs/>
+              </w:rPr>
+              <w:t xml:space="preserve">since completed (7 Oct), docx and PDF built</w:t>
+            </w:r>
+          </w:p>
+        </w:tc>
+      </w:tr>
+      <w:tr>
+        <w:tc>
+          <w:tcPr/>
+          <w:p>
+            <w:pPr>
+              <w:pStyle w:val="Compact"/>
+            </w:pPr>
+            <w:r>
+              <w:t xml:space="preserve">7–11</w:t>
+            </w:r>
+          </w:p>
+        </w:tc>
+        <w:tc>
+          <w:tcPr/>
+          <w:p>
+            <w:pPr>
+              <w:pStyle w:val="Compact"/>
+            </w:pPr>
+            <w:r>
+              <w:t xml:space="preserve">later volumes</w:t>
+            </w:r>
+          </w:p>
+        </w:tc>
+        <w:tc>
+          <w:tcPr/>
+          <w:p>
+            <w:pPr>
+              <w:pStyle w:val="Compact"/>
+            </w:pPr>
+            <w:r>
+              <w:t xml:space="preserve">Started after this session (see update note above)</w:t>
             </w:r>
           </w:p>
         </w:tc>
@@ -356,20 +491,7 @@
         <w:pStyle w:val="BodyText"/>
       </w:pPr>
       <w:r>
-        <w:t xml:space="preserve">Volume 6 position: Sūkta 62, Rik 62.5, Special Topics;</w:t>
-      </w:r>
-      <w:r>
-        <w:t xml:space="preserve"> </w:t>
-      </w:r>
-      <w:r>
-        <w:rPr>
-          <w:b/>
-          <w:bCs/>
-        </w:rPr>
-        <w:t xml:space="preserve">next page is printed p. 29 (PDF 47)</w:t>
-      </w:r>
-      <w:r>
-        <w:t xml:space="preserve">. Printed page = PDF − 18. Sūkta 62 has 13 Riks and runs to about printed p. 60.</w:t>
+        <w:t xml:space="preserve">Volume 6 position at the end of this session: Sūkta 62, Rik 62.5, Special Topics; next page was printed p. 29 (PDF 47). Printed page = PDF − 18. (Superseded: Volume 6 is now complete.)</w:t>
       </w:r>
     </w:p>
     <w:p>
@@ -1711,16 +1833,31 @@
       </w:pPr>
       <w:r>
         <w:rPr>
+          <w:strike/>
+        </w:rPr>
+        <w:t xml:space="preserve">Continue Sūkta 62 and Sūktas 63–80</w:t>
+      </w:r>
+      <w:r>
+        <w:t xml:space="preserve"> </w:t>
+      </w:r>
+      <w:r>
+        <w:t xml:space="preserve">—</w:t>
+      </w:r>
+      <w:r>
+        <w:t xml:space="preserve"> </w:t>
+      </w:r>
+      <w:r>
+        <w:rPr>
           <w:b/>
           <w:bCs/>
         </w:rPr>
-        <w:t xml:space="preserve">Continue Sūkta 62 from printed p. 29 (PDF 47)</w:t>
-      </w:r>
-      <w:r>
-        <w:t xml:space="preserve"> </w:t>
-      </w:r>
-      <w:r>
-        <w:t xml:space="preserve">— Rik 62.5 Special Topics, then Riks 62.6–62.13 (to about p. 60).</w:t>
+        <w:t xml:space="preserve">done in later sessions</w:t>
+      </w:r>
+      <w:r>
+        <w:t xml:space="preserve"> </w:t>
+      </w:r>
+      <w:r>
+        <w:t xml:space="preserve">(Volume 6 complete 7 Oct).</w:t>
       </w:r>
     </w:p>
     <w:p>
@@ -1732,7 +1869,19 @@
         </w:numPr>
       </w:pPr>
       <w:r>
-        <w:t xml:space="preserve">Sūktas 63–80, one Sūkta per session, following</w:t>
+        <w:t xml:space="preserve">Check the Volume 6 header’s abbreviation key against PDF 18 (copied from Volume 5; not confirmed in this session).</w:t>
+      </w:r>
+    </w:p>
+    <w:p>
+      <w:pPr>
+        <w:pStyle w:val="Compact"/>
+        <w:numPr>
+          <w:ilvl w:val="0"/>
+          <w:numId w:val="1014"/>
+        </w:numPr>
+      </w:pPr>
+      <w:r>
+        <w:t xml:space="preserve">Carry on with the current volume as recorded in</w:t>
       </w:r>
       <w:r>
         <w:t xml:space="preserve"> </w:t>
@@ -1747,7 +1896,7 @@
         <w:t xml:space="preserve"> </w:t>
       </w:r>
       <w:r>
-        <w:t xml:space="preserve">conventions.</w:t>
+        <w:t xml:space="preserve">(Volumes 10–11 and the review/numeral passes noted there).</w:t>
       </w:r>
     </w:p>
     <w:p>
@@ -1759,19 +1908,7 @@
         </w:numPr>
       </w:pPr>
       <w:r>
-        <w:t xml:space="preserve">Check the abbreviation key against PDF 18 when first needed.</w:t>
-      </w:r>
-    </w:p>
-    <w:p>
-      <w:pPr>
-        <w:pStyle w:val="Compact"/>
-        <w:numPr>
-          <w:ilvl w:val="0"/>
-          <w:numId w:val="1014"/>
-        </w:numPr>
-      </w:pPr>
-      <w:r>
-        <w:t xml:space="preserve">Rebuild Volume 6 docx/PDF only when asked.</w:t>
+        <w:t xml:space="preserve">Rebuild docx/PDF for any volume only when asked.</w:t>
       </w:r>
     </w:p>
     <w:bookmarkEnd w:id="24"/>
@@ -2025,16 +2162,7 @@
         <w:pStyle w:val="BlockText"/>
       </w:pPr>
       <w:r>
-        <w:t xml:space="preserve">Continue the Volume 6 translation. Read CLAUDE.md and the last ~40 lines of Rigveda_Samhita_Vol6_English_Translation.md first. Work on branch claude/modest-ptolemy-9efv8s. Position: Sūkta 62, Rik 62.5, Special Topics, printed p. 29 (PDF 47) is next (printed page = PDF − 18). Source: Rig_Vol6.pdf. Follow the conventions in CLAUDE.md. Append only, replacing the single trailing</w:t>
-      </w:r>
-      <w:r>
-        <w:t xml:space="preserve"> </w:t>
-      </w:r>
-      <w:r>
-        <w:t xml:space="preserve">“Progress note”</w:t>
-      </w:r>
-      <w:r>
-        <w:t xml:space="preserve">; batches of 3 pages; commit and push after each batch. Don’t create a PR or rebuild docx/PDF unless asked.</w:t>
+        <w:t xml:space="preserve">Continue the Rigveda translation project. Read CLAUDE.md first (it holds the current position and conventions), then the last ~40 lines of the newest volume file named there. Work on branch claude/modest-ptolemy-9efv8s; commit and push after each batch; no PR and no docx/PDF rebuild unless I ask.</w:t>
       </w:r>
     </w:p>
     <w:p>

</xml_diff>